<commit_message>
Commit from GitHub Actions (Run linters and build artifacts)
</commit_message>
<xml_diff>
--- a/CommonNomenclature.docx
+++ b/CommonNomenclature.docx
@@ -3074,9 +3074,9 @@
               <w:rPr>
                 <w:sz w:val="20"/>
               </w:rPr>
-              <w:t>Decision 6/CMA.4 Annex I, paragraph 5</w:t>
+              <w:t>Decision 6/CMA.4, Annex I, paragraph 5</w:t>
               <w:br/>
-              <w:t>Decision 6/CMA.4 paragraph 17 (j)</w:t>
+              <w:t>Decision 6/CMA.4, paragraph 17(j)</w:t>
             </w:r>
           </w:p>
         </w:tc>
@@ -7313,7 +7313,9 @@
               <w:rPr>
                 <w:sz w:val="20"/>
               </w:rPr>
-              <w:t>Decision 6/CMA.4 paragraph 17 (j)</w:t>
+              <w:t>Decision 6/CMA.4, paragraph 17(j)</w:t>
+              <w:br/>
+              <w:t>Decision 6/CMA.4, Annex VII</w:t>
             </w:r>
           </w:p>
         </w:tc>

</xml_diff>